<commit_message>
Project Plan Halfway Done
</commit_message>
<xml_diff>
--- a/logs/Project_Plan_Group3.docx
+++ b/logs/Project_Plan_Group3.docx
@@ -67,12 +67,6 @@
         <w:gridCol w:w="6932"/>
       </w:tblGrid>
       <w:tr>
-        <w:tblPrEx>
-          <w:tblCellMar>
-            <w:top w:w="0" w:type="dxa"/>
-            <w:bottom w:w="0" w:type="dxa"/>
-          </w:tblCellMar>
-        </w:tblPrEx>
         <w:tc>
           <w:tcPr>
             <w:tcW w:w="2800" w:type="dxa"/>
@@ -114,12 +108,6 @@
         </w:tc>
       </w:tr>
       <w:tr>
-        <w:tblPrEx>
-          <w:tblCellMar>
-            <w:top w:w="0" w:type="dxa"/>
-            <w:bottom w:w="0" w:type="dxa"/>
-          </w:tblCellMar>
-        </w:tblPrEx>
         <w:tc>
           <w:tcPr>
             <w:tcW w:w="2800" w:type="dxa"/>
@@ -169,12 +157,6 @@
         </w:tc>
       </w:tr>
       <w:tr>
-        <w:tblPrEx>
-          <w:tblCellMar>
-            <w:top w:w="0" w:type="dxa"/>
-            <w:bottom w:w="0" w:type="dxa"/>
-          </w:tblCellMar>
-        </w:tblPrEx>
         <w:tc>
           <w:tcPr>
             <w:tcW w:w="2800" w:type="dxa"/>
@@ -214,12 +196,6 @@
         </w:tc>
       </w:tr>
       <w:tr>
-        <w:tblPrEx>
-          <w:tblCellMar>
-            <w:top w:w="0" w:type="dxa"/>
-            <w:bottom w:w="0" w:type="dxa"/>
-          </w:tblCellMar>
-        </w:tblPrEx>
         <w:tc>
           <w:tcPr>
             <w:tcW w:w="2800" w:type="dxa"/>
@@ -253,18 +229,18 @@
           </w:tcPr>
           <w:p>
             <w:r>
-              <w:t>25/08/2026</w:t>
+              <w:t>2</w:t>
+            </w:r>
+            <w:r>
+              <w:t>7</w:t>
+            </w:r>
+            <w:r>
+              <w:t>/08/2026</w:t>
             </w:r>
           </w:p>
         </w:tc>
       </w:tr>
       <w:tr>
-        <w:tblPrEx>
-          <w:tblCellMar>
-            <w:top w:w="0" w:type="dxa"/>
-            <w:bottom w:w="0" w:type="dxa"/>
-          </w:tblCellMar>
-        </w:tblPrEx>
         <w:tc>
           <w:tcPr>
             <w:tcW w:w="2800" w:type="dxa"/>
@@ -465,12 +441,6 @@
         <w:gridCol w:w="9896"/>
       </w:tblGrid>
       <w:tr>
-        <w:tblPrEx>
-          <w:tblCellMar>
-            <w:top w:w="0" w:type="dxa"/>
-            <w:bottom w:w="0" w:type="dxa"/>
-          </w:tblCellMar>
-        </w:tblPrEx>
         <w:tc>
           <w:tcPr>
             <w:tcW w:w="9350" w:type="dxa"/>
@@ -613,12 +583,6 @@
         <w:gridCol w:w="9896"/>
       </w:tblGrid>
       <w:tr>
-        <w:tblPrEx>
-          <w:tblCellMar>
-            <w:top w:w="0" w:type="dxa"/>
-            <w:bottom w:w="0" w:type="dxa"/>
-          </w:tblCellMar>
-        </w:tblPrEx>
         <w:tc>
           <w:tcPr>
             <w:tcW w:w="9350" w:type="dxa"/>
@@ -768,12 +732,6 @@
         <w:gridCol w:w="9896"/>
       </w:tblGrid>
       <w:tr>
-        <w:tblPrEx>
-          <w:tblCellMar>
-            <w:top w:w="0" w:type="dxa"/>
-            <w:bottom w:w="0" w:type="dxa"/>
-          </w:tblCellMar>
-        </w:tblPrEx>
         <w:tc>
           <w:tcPr>
             <w:tcW w:w="9350" w:type="dxa"/>
@@ -916,12 +874,6 @@
         <w:gridCol w:w="9896"/>
       </w:tblGrid>
       <w:tr>
-        <w:tblPrEx>
-          <w:tblCellMar>
-            <w:top w:w="0" w:type="dxa"/>
-            <w:bottom w:w="0" w:type="dxa"/>
-          </w:tblCellMar>
-        </w:tblPrEx>
         <w:tc>
           <w:tcPr>
             <w:tcW w:w="9350" w:type="dxa"/>
@@ -962,6 +914,22 @@
               <w:spacing w:after="160"/>
             </w:pPr>
             <w:r>
+              <w:t xml:space="preserve">A long-term benefit would be that the final report may be a useful document to show off when applying for job/research positions within the </w:t>
+            </w:r>
+            <w:proofErr w:type="gramStart"/>
+            <w:r>
+              <w:t>fields</w:t>
+            </w:r>
+            <w:proofErr w:type="gramEnd"/>
+            <w:r>
+              <w:t xml:space="preserve"> statistics and data science.</w:t>
+            </w:r>
+          </w:p>
+          <w:p>
+            <w:pPr>
+              <w:spacing w:after="160"/>
+            </w:pPr>
+            <w:r>
               <w:t xml:space="preserve">For </w:t>
             </w:r>
             <w:proofErr w:type="spellStart"/>
@@ -970,7 +938,18 @@
             </w:r>
             <w:proofErr w:type="spellEnd"/>
             <w:r>
-              <w:t>, their benefit is potentially innovative models…</w:t>
+              <w:t>, their benefit is potentially innovative models</w:t>
+            </w:r>
+            <w:r>
+              <w:t xml:space="preserve"> or methodology that help them improve their techniques. This may lead to greater profit for </w:t>
+            </w:r>
+            <w:proofErr w:type="spellStart"/>
+            <w:r>
+              <w:t>Logikcube</w:t>
+            </w:r>
+            <w:proofErr w:type="spellEnd"/>
+            <w:r>
+              <w:t xml:space="preserve"> as more companies invest in them.</w:t>
             </w:r>
           </w:p>
           <w:p>
@@ -1012,6 +991,7 @@
           <w:sz w:val="28"/>
           <w:szCs w:val="28"/>
         </w:rPr>
+        <w:lastRenderedPageBreak/>
         <w:t>3. Objectives</w:t>
       </w:r>
     </w:p>
@@ -1049,12 +1029,6 @@
         <w:gridCol w:w="9896"/>
       </w:tblGrid>
       <w:tr>
-        <w:tblPrEx>
-          <w:tblCellMar>
-            <w:top w:w="0" w:type="dxa"/>
-            <w:bottom w:w="0" w:type="dxa"/>
-          </w:tblCellMar>
-        </w:tblPrEx>
         <w:tc>
           <w:tcPr>
             <w:tcW w:w="9350" w:type="dxa"/>
@@ -1084,7 +1058,6 @@
                 <w:sz w:val="20"/>
                 <w:szCs w:val="20"/>
               </w:rPr>
-              <w:lastRenderedPageBreak/>
               <w:t>Guiding questions</w:t>
             </w:r>
           </w:p>
@@ -1180,12 +1153,6 @@
         <w:gridCol w:w="9896"/>
       </w:tblGrid>
       <w:tr>
-        <w:tblPrEx>
-          <w:tblCellMar>
-            <w:top w:w="0" w:type="dxa"/>
-            <w:bottom w:w="0" w:type="dxa"/>
-          </w:tblCellMar>
-        </w:tblPrEx>
         <w:tc>
           <w:tcPr>
             <w:tcW w:w="9350" w:type="dxa"/>
@@ -1300,6 +1267,82 @@
             <w:proofErr w:type="spellEnd"/>
             <w:r>
               <w:t>)</w:t>
+            </w:r>
+          </w:p>
+          <w:p>
+            <w:pPr>
+              <w:spacing w:after="160"/>
+            </w:pPr>
+            <w:r>
+              <w:t>SMART:</w:t>
+            </w:r>
+          </w:p>
+          <w:p>
+            <w:pPr>
+              <w:numPr>
+                <w:ilvl w:val="0"/>
+                <w:numId w:val="5"/>
+              </w:numPr>
+              <w:spacing w:after="160"/>
+            </w:pPr>
+            <w:r>
+              <w:t xml:space="preserve">Specific: A model that forecasts probability for customer conversion depending on attribution pathways via channel </w:t>
+            </w:r>
+            <w:proofErr w:type="gramStart"/>
+            <w:r>
+              <w:t>touch-points</w:t>
+            </w:r>
+            <w:proofErr w:type="gramEnd"/>
+            <w:r>
+              <w:t>.</w:t>
+            </w:r>
+          </w:p>
+          <w:p>
+            <w:pPr>
+              <w:numPr>
+                <w:ilvl w:val="0"/>
+                <w:numId w:val="5"/>
+              </w:numPr>
+              <w:spacing w:after="160"/>
+            </w:pPr>
+            <w:r>
+              <w:t>Measurable: Quantitatively conveys information relative to the goals.</w:t>
+            </w:r>
+          </w:p>
+          <w:p>
+            <w:pPr>
+              <w:numPr>
+                <w:ilvl w:val="0"/>
+                <w:numId w:val="5"/>
+              </w:numPr>
+              <w:spacing w:after="160"/>
+            </w:pPr>
+            <w:r>
+              <w:t>Achievable: Yes.</w:t>
+            </w:r>
+          </w:p>
+          <w:p>
+            <w:pPr>
+              <w:numPr>
+                <w:ilvl w:val="0"/>
+                <w:numId w:val="5"/>
+              </w:numPr>
+              <w:spacing w:after="160"/>
+            </w:pPr>
+            <w:r>
+              <w:t>Relevant: Predictive model and methods should be applicable and easily extendable to similar datasets about customer conversion advertisement pathways.</w:t>
+            </w:r>
+          </w:p>
+          <w:p>
+            <w:pPr>
+              <w:numPr>
+                <w:ilvl w:val="0"/>
+                <w:numId w:val="5"/>
+              </w:numPr>
+              <w:spacing w:after="160"/>
+            </w:pPr>
+            <w:r>
+              <w:t>Time-bound: Requires completion within 3-month period.</w:t>
             </w:r>
           </w:p>
         </w:tc>
@@ -1363,12 +1406,6 @@
         <w:gridCol w:w="9896"/>
       </w:tblGrid>
       <w:tr>
-        <w:tblPrEx>
-          <w:tblCellMar>
-            <w:top w:w="0" w:type="dxa"/>
-            <w:bottom w:w="0" w:type="dxa"/>
-          </w:tblCellMar>
-        </w:tblPrEx>
         <w:tc>
           <w:tcPr>
             <w:tcW w:w="9350" w:type="dxa"/>
@@ -1484,12 +1521,6 @@
         <w:gridCol w:w="9896"/>
       </w:tblGrid>
       <w:tr>
-        <w:tblPrEx>
-          <w:tblCellMar>
-            <w:top w:w="0" w:type="dxa"/>
-            <w:bottom w:w="0" w:type="dxa"/>
-          </w:tblCellMar>
-        </w:tblPrEx>
         <w:tc>
           <w:tcPr>
             <w:tcW w:w="9350" w:type="dxa"/>
@@ -1511,14 +1542,90 @@
               <w:spacing w:after="160"/>
             </w:pPr>
             <w:r>
-              <w:rPr>
-                <w:i/>
-                <w:iCs/>
-                <w:color w:val="8C8C8C"/>
-                <w:sz w:val="18"/>
-                <w:szCs w:val="18"/>
-              </w:rPr>
-              <w:t>Your response:</w:t>
+              <w:lastRenderedPageBreak/>
+              <w:t>Some</w:t>
+            </w:r>
+            <w:r>
+              <w:t xml:space="preserve"> of the assumptions relate to the interpretation of</w:t>
+            </w:r>
+            <w:r>
+              <w:t xml:space="preserve"> </w:t>
+            </w:r>
+            <w:proofErr w:type="spellStart"/>
+            <w:r>
+              <w:t>Logikcube’s</w:t>
+            </w:r>
+            <w:proofErr w:type="spellEnd"/>
+            <w:r>
+              <w:t xml:space="preserve"> language used in the task description.</w:t>
+            </w:r>
+          </w:p>
+          <w:p>
+            <w:pPr>
+              <w:spacing w:after="160"/>
+            </w:pPr>
+            <w:r>
+              <w:t>Other assumptions relate to the limitations of the data.</w:t>
+            </w:r>
+          </w:p>
+          <w:p>
+            <w:pPr>
+              <w:pStyle w:val="ListParagraph"/>
+              <w:numPr>
+                <w:ilvl w:val="0"/>
+                <w:numId w:val="5"/>
+              </w:numPr>
+              <w:spacing w:after="160"/>
+            </w:pPr>
+            <w:r>
+              <w:t>Customers can only interact with the channels provided in the dataset.</w:t>
+            </w:r>
+          </w:p>
+          <w:p>
+            <w:pPr>
+              <w:pStyle w:val="ListParagraph"/>
+              <w:numPr>
+                <w:ilvl w:val="0"/>
+                <w:numId w:val="5"/>
+              </w:numPr>
+              <w:spacing w:after="160"/>
+            </w:pPr>
+            <w:r>
+              <w:t>Each conversion has equal weight.</w:t>
+            </w:r>
+          </w:p>
+          <w:p>
+            <w:pPr>
+              <w:spacing w:after="160"/>
+            </w:pPr>
+            <w:r>
+              <w:t>Main constraints of the project:</w:t>
+            </w:r>
+          </w:p>
+          <w:p>
+            <w:pPr>
+              <w:pStyle w:val="ListParagraph"/>
+              <w:numPr>
+                <w:ilvl w:val="0"/>
+                <w:numId w:val="4"/>
+              </w:numPr>
+              <w:spacing w:after="160"/>
+            </w:pPr>
+            <w:r>
+              <w:t>Only 3 people in the group who cannot work full-time on the project.</w:t>
+            </w:r>
+          </w:p>
+          <w:p>
+            <w:pPr>
+              <w:pStyle w:val="ListParagraph"/>
+              <w:numPr>
+                <w:ilvl w:val="0"/>
+                <w:numId w:val="4"/>
+              </w:numPr>
+              <w:spacing w:after="160"/>
+            </w:pPr>
+            <w:r>
+              <w:t>The project is required to be completed within a 10-week period.</w:t>
             </w:r>
           </w:p>
           <w:p>
@@ -1597,12 +1704,6 @@
         <w:gridCol w:w="9896"/>
       </w:tblGrid>
       <w:tr>
-        <w:tblPrEx>
-          <w:tblCellMar>
-            <w:top w:w="0" w:type="dxa"/>
-            <w:bottom w:w="0" w:type="dxa"/>
-          </w:tblCellMar>
-        </w:tblPrEx>
         <w:tc>
           <w:tcPr>
             <w:tcW w:w="9350" w:type="dxa"/>
@@ -1650,7 +1751,6 @@
                 <w:sz w:val="20"/>
                 <w:szCs w:val="20"/>
               </w:rPr>
-              <w:lastRenderedPageBreak/>
               <w:t>Linear (waterfall) or iterative? Why does that suit this project?</w:t>
             </w:r>
           </w:p>
@@ -1719,12 +1819,6 @@
         <w:gridCol w:w="9896"/>
       </w:tblGrid>
       <w:tr>
-        <w:tblPrEx>
-          <w:tblCellMar>
-            <w:top w:w="0" w:type="dxa"/>
-            <w:bottom w:w="0" w:type="dxa"/>
-          </w:tblCellMar>
-        </w:tblPrEx>
         <w:tc>
           <w:tcPr>
             <w:tcW w:w="9350" w:type="dxa"/>
@@ -1746,30 +1840,33 @@
               <w:spacing w:after="160"/>
             </w:pPr>
             <w:r>
-              <w:rPr>
-                <w:i/>
-                <w:iCs/>
-                <w:color w:val="8C8C8C"/>
-                <w:sz w:val="18"/>
-                <w:szCs w:val="18"/>
-              </w:rPr>
-              <w:t>Your response:</w:t>
-            </w:r>
-          </w:p>
-          <w:p>
-            <w:pPr>
-              <w:spacing w:after="200"/>
-            </w:pPr>
-          </w:p>
-          <w:p>
-            <w:pPr>
-              <w:spacing w:after="200"/>
-            </w:pPr>
-          </w:p>
-          <w:p>
-            <w:pPr>
-              <w:spacing w:after="200"/>
-            </w:pPr>
+              <w:t xml:space="preserve">The approach to the project will be naturally start linear and expand to become more iterative, especially after the predictive models in Task 1 are complete. </w:t>
+            </w:r>
+            <w:r>
+              <w:t>Once Task 1 is complete, each member will choose sections of the remaining tasks and report sections.</w:t>
+            </w:r>
+          </w:p>
+          <w:p>
+            <w:pPr>
+              <w:spacing w:after="160"/>
+            </w:pPr>
+            <w:r>
+              <w:t>The goal would be to build prototypes and continue to improve on them until the final model is satisfactory to us and the marking criteria.</w:t>
+            </w:r>
+          </w:p>
+          <w:p>
+            <w:pPr>
+              <w:spacing w:after="160"/>
+            </w:pPr>
+            <w:r>
+              <w:t xml:space="preserve">High-level Project Lifecycle – consistent communication and contribution between all members, which include new ideas and perspectives. Proof-reading and model testing on </w:t>
+            </w:r>
+            <w:r>
+              <w:t>each other’s</w:t>
+            </w:r>
+            <w:r>
+              <w:t xml:space="preserve"> prototypes to ensure reproducible models and methods.</w:t>
+            </w:r>
           </w:p>
         </w:tc>
       </w:tr>
@@ -1832,12 +1929,6 @@
         <w:gridCol w:w="9896"/>
       </w:tblGrid>
       <w:tr>
-        <w:tblPrEx>
-          <w:tblCellMar>
-            <w:top w:w="0" w:type="dxa"/>
-            <w:bottom w:w="0" w:type="dxa"/>
-          </w:tblCellMar>
-        </w:tblPrEx>
         <w:tc>
           <w:tcPr>
             <w:tcW w:w="9350" w:type="dxa"/>
@@ -1962,12 +2053,6 @@
         <w:gridCol w:w="9896"/>
       </w:tblGrid>
       <w:tr>
-        <w:tblPrEx>
-          <w:tblCellMar>
-            <w:top w:w="0" w:type="dxa"/>
-            <w:bottom w:w="0" w:type="dxa"/>
-          </w:tblCellMar>
-        </w:tblPrEx>
         <w:tc>
           <w:tcPr>
             <w:tcW w:w="9350" w:type="dxa"/>
@@ -1989,15 +2074,58 @@
               <w:spacing w:after="160"/>
             </w:pPr>
             <w:r>
-              <w:rPr>
-                <w:i/>
-                <w:iCs/>
-                <w:color w:val="8C8C8C"/>
-                <w:sz w:val="18"/>
-                <w:szCs w:val="18"/>
-              </w:rPr>
-              <w:t>Your response:</w:t>
-            </w:r>
+              <w:lastRenderedPageBreak/>
+              <w:t>START:</w:t>
+            </w:r>
+          </w:p>
+          <w:p>
+            <w:pPr>
+              <w:pStyle w:val="ListParagraph"/>
+              <w:numPr>
+                <w:ilvl w:val="0"/>
+                <w:numId w:val="4"/>
+              </w:numPr>
+              <w:spacing w:after="160"/>
+            </w:pPr>
+            <w:r>
+              <w:t>Early project timeline planning</w:t>
+            </w:r>
+          </w:p>
+          <w:p>
+            <w:pPr>
+              <w:pStyle w:val="ListParagraph"/>
+              <w:numPr>
+                <w:ilvl w:val="0"/>
+                <w:numId w:val="4"/>
+              </w:numPr>
+              <w:spacing w:after="160"/>
+            </w:pPr>
+            <w:r>
+              <w:t>Initial literary research into predictive modelling for Task 1</w:t>
+            </w:r>
+          </w:p>
+          <w:p>
+            <w:pPr>
+              <w:pStyle w:val="ListParagraph"/>
+              <w:numPr>
+                <w:ilvl w:val="0"/>
+                <w:numId w:val="4"/>
+              </w:numPr>
+              <w:spacing w:after="160"/>
+            </w:pPr>
+            <w:r>
+              <w:t>Data cleaning + modelling</w:t>
+            </w:r>
+          </w:p>
+          <w:p>
+            <w:pPr>
+              <w:pStyle w:val="ListParagraph"/>
+              <w:numPr>
+                <w:ilvl w:val="0"/>
+                <w:numId w:val="4"/>
+              </w:numPr>
+              <w:spacing w:after="160"/>
+            </w:pPr>
           </w:p>
           <w:p>
             <w:pPr>
@@ -2012,6 +2140,30 @@
           <w:p>
             <w:pPr>
               <w:spacing w:after="200"/>
+            </w:pPr>
+          </w:p>
+        </w:tc>
+      </w:tr>
+      <w:tr>
+        <w:tc>
+          <w:tcPr>
+            <w:tcW w:w="9350" w:type="dxa"/>
+            <w:tcBorders>
+              <w:top w:val="dashed" w:sz="4" w:space="0" w:color="9DB4C7"/>
+              <w:left w:val="dashed" w:sz="4" w:space="0" w:color="9DB4C7"/>
+              <w:bottom w:val="dashed" w:sz="4" w:space="0" w:color="9DB4C7"/>
+              <w:right w:val="dashed" w:sz="4" w:space="0" w:color="9DB4C7"/>
+            </w:tcBorders>
+            <w:tcMar>
+              <w:top w:w="160" w:type="dxa"/>
+              <w:left w:w="200" w:type="dxa"/>
+              <w:bottom w:w="160" w:type="dxa"/>
+              <w:right w:w="200" w:type="dxa"/>
+            </w:tcMar>
+          </w:tcPr>
+          <w:p>
+            <w:pPr>
+              <w:spacing w:after="160"/>
             </w:pPr>
           </w:p>
         </w:tc>
@@ -2075,12 +2227,6 @@
         <w:gridCol w:w="9896"/>
       </w:tblGrid>
       <w:tr>
-        <w:tblPrEx>
-          <w:tblCellMar>
-            <w:top w:w="0" w:type="dxa"/>
-            <w:bottom w:w="0" w:type="dxa"/>
-          </w:tblCellMar>
-        </w:tblPrEx>
         <w:tc>
           <w:tcPr>
             <w:tcW w:w="9350" w:type="dxa"/>
@@ -2205,12 +2351,6 @@
         <w:gridCol w:w="9896"/>
       </w:tblGrid>
       <w:tr>
-        <w:tblPrEx>
-          <w:tblCellMar>
-            <w:top w:w="0" w:type="dxa"/>
-            <w:bottom w:w="0" w:type="dxa"/>
-          </w:tblCellMar>
-        </w:tblPrEx>
         <w:tc>
           <w:tcPr>
             <w:tcW w:w="9350" w:type="dxa"/>
@@ -2318,12 +2458,6 @@
         <w:gridCol w:w="9896"/>
       </w:tblGrid>
       <w:tr>
-        <w:tblPrEx>
-          <w:tblCellMar>
-            <w:top w:w="0" w:type="dxa"/>
-            <w:bottom w:w="0" w:type="dxa"/>
-          </w:tblCellMar>
-        </w:tblPrEx>
         <w:tc>
           <w:tcPr>
             <w:tcW w:w="9350" w:type="dxa"/>
@@ -2439,12 +2573,6 @@
         <w:gridCol w:w="9896"/>
       </w:tblGrid>
       <w:tr>
-        <w:tblPrEx>
-          <w:tblCellMar>
-            <w:top w:w="0" w:type="dxa"/>
-            <w:bottom w:w="0" w:type="dxa"/>
-          </w:tblCellMar>
-        </w:tblPrEx>
         <w:tc>
           <w:tcPr>
             <w:tcW w:w="9350" w:type="dxa"/>
@@ -2466,15 +2594,198 @@
               <w:spacing w:after="160"/>
             </w:pPr>
             <w:r>
-              <w:rPr>
-                <w:i/>
-                <w:iCs/>
-                <w:color w:val="8C8C8C"/>
-                <w:sz w:val="18"/>
-                <w:szCs w:val="18"/>
-              </w:rPr>
-              <w:t>Your response:</w:t>
-            </w:r>
+              <w:t>1 -- Predictive Modelling</w:t>
+            </w:r>
+          </w:p>
+          <w:p>
+            <w:pPr>
+              <w:spacing w:after="160"/>
+            </w:pPr>
+            <w:r>
+              <w:lastRenderedPageBreak/>
+              <w:t>Model 1 &amp; 2</w:t>
+            </w:r>
+          </w:p>
+          <w:p>
+            <w:pPr>
+              <w:spacing w:after="160"/>
+            </w:pPr>
+            <w:r>
+              <w:tab/>
+            </w:r>
+            <w:r>
+              <w:t>Assumptions</w:t>
+            </w:r>
+          </w:p>
+          <w:p>
+            <w:pPr>
+              <w:spacing w:after="160"/>
+            </w:pPr>
+            <w:r>
+              <w:tab/>
+            </w:r>
+            <w:r>
+              <w:t>Data cleaning</w:t>
+            </w:r>
+            <w:r>
+              <w:t xml:space="preserve"> – (1) new dataset without non-returning customer data. (2)</w:t>
+            </w:r>
+          </w:p>
+          <w:p>
+            <w:pPr>
+              <w:spacing w:after="160"/>
+            </w:pPr>
+            <w:r>
+              <w:tab/>
+            </w:r>
+            <w:r>
+              <w:t>Feature engineering</w:t>
+            </w:r>
+            <w:r>
+              <w:t xml:space="preserve"> – extending dataset columns for deeper analysis between groups.</w:t>
+            </w:r>
+          </w:p>
+          <w:p>
+            <w:pPr>
+              <w:spacing w:after="160"/>
+            </w:pPr>
+            <w:r>
+              <w:tab/>
+            </w:r>
+            <w:r>
+              <w:t>Literature Review</w:t>
+            </w:r>
+            <w:r>
+              <w:t xml:space="preserve"> – for model decisions.</w:t>
+            </w:r>
+          </w:p>
+          <w:p>
+            <w:pPr>
+              <w:spacing w:after="160"/>
+            </w:pPr>
+            <w:r>
+              <w:tab/>
+            </w:r>
+            <w:r>
+              <w:t>Model fitting</w:t>
+            </w:r>
+          </w:p>
+          <w:p>
+            <w:pPr>
+              <w:spacing w:after="160"/>
+            </w:pPr>
+            <w:r>
+              <w:tab/>
+              <w:t>M</w:t>
+            </w:r>
+            <w:r>
+              <w:t>odel testing</w:t>
+            </w:r>
+          </w:p>
+          <w:p>
+            <w:pPr>
+              <w:spacing w:after="160"/>
+            </w:pPr>
+            <w:r>
+              <w:tab/>
+              <w:t>IMPROVE AND LOOSEN CONSTRAINT</w:t>
+            </w:r>
+            <w:r>
+              <w:t>S</w:t>
+            </w:r>
+          </w:p>
+          <w:p>
+            <w:pPr>
+              <w:spacing w:after="160"/>
+            </w:pPr>
+            <w:r>
+              <w:t>2 -- Customer Life Cycle Stages</w:t>
+            </w:r>
+          </w:p>
+          <w:p>
+            <w:pPr>
+              <w:spacing w:after="160"/>
+            </w:pPr>
+            <w:r>
+              <w:t>Design a method to assign life cycle labels to customers.</w:t>
+            </w:r>
+          </w:p>
+          <w:p>
+            <w:pPr>
+              <w:spacing w:after="160"/>
+            </w:pPr>
+            <w:r>
+              <w:tab/>
+              <w:t>ASSUMPTIONS – breaking down life cycle labels depending on data.</w:t>
+            </w:r>
+          </w:p>
+          <w:p>
+            <w:pPr>
+              <w:spacing w:after="160"/>
+            </w:pPr>
+            <w:r>
+              <w:t>Verify performance of the method used.</w:t>
+            </w:r>
+          </w:p>
+          <w:p>
+            <w:pPr>
+              <w:spacing w:after="160"/>
+            </w:pPr>
+            <w:r>
+              <w:tab/>
+              <w:t>PREDICTIVE MODEL INTEGRATION</w:t>
+            </w:r>
+          </w:p>
+          <w:p>
+            <w:pPr>
+              <w:spacing w:after="160"/>
+            </w:pPr>
+            <w:r>
+              <w:t> </w:t>
+            </w:r>
+          </w:p>
+          <w:p>
+            <w:pPr>
+              <w:spacing w:after="160"/>
+            </w:pPr>
+            <w:r>
+              <w:t>3 -- Business Success Attribution </w:t>
+            </w:r>
+          </w:p>
+          <w:p>
+            <w:pPr>
+              <w:spacing w:after="160"/>
+            </w:pPr>
+            <w:r>
+              <w:t>Model 1, 2 &amp; 3</w:t>
+            </w:r>
+          </w:p>
+          <w:p>
+            <w:pPr>
+              <w:spacing w:after="160"/>
+            </w:pPr>
+            <w:r>
+              <w:tab/>
+              <w:t>LITERATURE REVIEW – attribution models.</w:t>
+            </w:r>
+          </w:p>
+          <w:p>
+            <w:pPr>
+              <w:spacing w:after="160"/>
+            </w:pPr>
+            <w:r>
+              <w:tab/>
+              <w:t xml:space="preserve">MODEL ITERATION COMPARISON – (2) Journey touch-point length, and (3) </w:t>
+            </w:r>
+            <w:r>
+              <w:tab/>
+              <w:t>nested channels</w:t>
+            </w:r>
+          </w:p>
+          <w:p>
+            <w:pPr>
+              <w:spacing w:after="160"/>
+            </w:pPr>
           </w:p>
           <w:p>
             <w:pPr>
@@ -2552,12 +2863,6 @@
         <w:gridCol w:w="9896"/>
       </w:tblGrid>
       <w:tr>
-        <w:tblPrEx>
-          <w:tblCellMar>
-            <w:top w:w="0" w:type="dxa"/>
-            <w:bottom w:w="0" w:type="dxa"/>
-          </w:tblCellMar>
-        </w:tblPrEx>
         <w:tc>
           <w:tcPr>
             <w:tcW w:w="9350" w:type="dxa"/>
@@ -2664,12 +2969,6 @@
         <w:gridCol w:w="9896"/>
       </w:tblGrid>
       <w:tr>
-        <w:tblPrEx>
-          <w:tblCellMar>
-            <w:top w:w="0" w:type="dxa"/>
-            <w:bottom w:w="0" w:type="dxa"/>
-          </w:tblCellMar>
-        </w:tblPrEx>
         <w:tc>
           <w:tcPr>
             <w:tcW w:w="9350" w:type="dxa"/>
@@ -2686,24 +2985,365 @@
               <w:right w:w="200" w:type="dxa"/>
             </w:tcMar>
           </w:tcPr>
+          <w:tbl>
+            <w:tblPr>
+              <w:tblStyle w:val="TableGrid"/>
+              <w:tblW w:w="0" w:type="auto"/>
+              <w:tblLook w:val="04A0" w:firstRow="1" w:lastRow="0" w:firstColumn="1" w:lastColumn="0" w:noHBand="0" w:noVBand="1"/>
+            </w:tblPr>
+            <w:tblGrid>
+              <w:gridCol w:w="1897"/>
+              <w:gridCol w:w="1897"/>
+              <w:gridCol w:w="1897"/>
+              <w:gridCol w:w="1897"/>
+              <w:gridCol w:w="1898"/>
+            </w:tblGrid>
+            <w:tr>
+              <w:tc>
+                <w:tcPr>
+                  <w:tcW w:w="1897" w:type="dxa"/>
+                </w:tcPr>
+                <w:p>
+                  <w:pPr>
+                    <w:spacing w:after="160"/>
+                  </w:pPr>
+                  <w:r>
+                    <w:t>Task</w:t>
+                  </w:r>
+                </w:p>
+              </w:tc>
+              <w:tc>
+                <w:tcPr>
+                  <w:tcW w:w="1897" w:type="dxa"/>
+                </w:tcPr>
+                <w:p>
+                  <w:pPr>
+                    <w:spacing w:after="160"/>
+                  </w:pPr>
+                  <w:r>
+                    <w:t>Team Lead</w:t>
+                  </w:r>
+                </w:p>
+              </w:tc>
+              <w:tc>
+                <w:tcPr>
+                  <w:tcW w:w="1897" w:type="dxa"/>
+                </w:tcPr>
+                <w:p>
+                  <w:pPr>
+                    <w:spacing w:after="160"/>
+                  </w:pPr>
+                  <w:r>
+                    <w:t>Tester/Editor</w:t>
+                  </w:r>
+                </w:p>
+              </w:tc>
+              <w:tc>
+                <w:tcPr>
+                  <w:tcW w:w="1897" w:type="dxa"/>
+                </w:tcPr>
+                <w:p>
+                  <w:pPr>
+                    <w:spacing w:after="160"/>
+                  </w:pPr>
+                  <w:r>
+                    <w:t>Stakeholder</w:t>
+                  </w:r>
+                </w:p>
+              </w:tc>
+              <w:tc>
+                <w:tcPr>
+                  <w:tcW w:w="1898" w:type="dxa"/>
+                </w:tcPr>
+                <w:p>
+                  <w:pPr>
+                    <w:spacing w:after="160"/>
+                  </w:pPr>
+                </w:p>
+              </w:tc>
+            </w:tr>
+            <w:tr>
+              <w:tc>
+                <w:tcPr>
+                  <w:tcW w:w="1897" w:type="dxa"/>
+                </w:tcPr>
+                <w:p>
+                  <w:pPr>
+                    <w:spacing w:after="160"/>
+                  </w:pPr>
+                </w:p>
+              </w:tc>
+              <w:tc>
+                <w:tcPr>
+                  <w:tcW w:w="1897" w:type="dxa"/>
+                </w:tcPr>
+                <w:p>
+                  <w:pPr>
+                    <w:spacing w:after="160"/>
+                  </w:pPr>
+                </w:p>
+              </w:tc>
+              <w:tc>
+                <w:tcPr>
+                  <w:tcW w:w="1897" w:type="dxa"/>
+                </w:tcPr>
+                <w:p>
+                  <w:pPr>
+                    <w:spacing w:after="160"/>
+                  </w:pPr>
+                </w:p>
+              </w:tc>
+              <w:tc>
+                <w:tcPr>
+                  <w:tcW w:w="1897" w:type="dxa"/>
+                </w:tcPr>
+                <w:p>
+                  <w:pPr>
+                    <w:spacing w:after="160"/>
+                  </w:pPr>
+                </w:p>
+              </w:tc>
+              <w:tc>
+                <w:tcPr>
+                  <w:tcW w:w="1898" w:type="dxa"/>
+                </w:tcPr>
+                <w:p>
+                  <w:pPr>
+                    <w:spacing w:after="160"/>
+                  </w:pPr>
+                </w:p>
+              </w:tc>
+            </w:tr>
+            <w:tr>
+              <w:tc>
+                <w:tcPr>
+                  <w:tcW w:w="1897" w:type="dxa"/>
+                </w:tcPr>
+                <w:p>
+                  <w:pPr>
+                    <w:spacing w:after="160"/>
+                  </w:pPr>
+                </w:p>
+              </w:tc>
+              <w:tc>
+                <w:tcPr>
+                  <w:tcW w:w="1897" w:type="dxa"/>
+                </w:tcPr>
+                <w:p>
+                  <w:pPr>
+                    <w:spacing w:after="160"/>
+                  </w:pPr>
+                </w:p>
+              </w:tc>
+              <w:tc>
+                <w:tcPr>
+                  <w:tcW w:w="1897" w:type="dxa"/>
+                </w:tcPr>
+                <w:p>
+                  <w:pPr>
+                    <w:spacing w:after="160"/>
+                  </w:pPr>
+                </w:p>
+              </w:tc>
+              <w:tc>
+                <w:tcPr>
+                  <w:tcW w:w="1897" w:type="dxa"/>
+                </w:tcPr>
+                <w:p>
+                  <w:pPr>
+                    <w:spacing w:after="160"/>
+                  </w:pPr>
+                </w:p>
+              </w:tc>
+              <w:tc>
+                <w:tcPr>
+                  <w:tcW w:w="1898" w:type="dxa"/>
+                </w:tcPr>
+                <w:p>
+                  <w:pPr>
+                    <w:spacing w:after="160"/>
+                  </w:pPr>
+                </w:p>
+              </w:tc>
+            </w:tr>
+            <w:tr>
+              <w:tc>
+                <w:tcPr>
+                  <w:tcW w:w="1897" w:type="dxa"/>
+                </w:tcPr>
+                <w:p>
+                  <w:pPr>
+                    <w:spacing w:after="160"/>
+                  </w:pPr>
+                </w:p>
+              </w:tc>
+              <w:tc>
+                <w:tcPr>
+                  <w:tcW w:w="1897" w:type="dxa"/>
+                </w:tcPr>
+                <w:p>
+                  <w:pPr>
+                    <w:spacing w:after="160"/>
+                  </w:pPr>
+                </w:p>
+              </w:tc>
+              <w:tc>
+                <w:tcPr>
+                  <w:tcW w:w="1897" w:type="dxa"/>
+                </w:tcPr>
+                <w:p>
+                  <w:pPr>
+                    <w:spacing w:after="160"/>
+                  </w:pPr>
+                </w:p>
+              </w:tc>
+              <w:tc>
+                <w:tcPr>
+                  <w:tcW w:w="1897" w:type="dxa"/>
+                </w:tcPr>
+                <w:p>
+                  <w:pPr>
+                    <w:spacing w:after="160"/>
+                  </w:pPr>
+                </w:p>
+              </w:tc>
+              <w:tc>
+                <w:tcPr>
+                  <w:tcW w:w="1898" w:type="dxa"/>
+                </w:tcPr>
+                <w:p>
+                  <w:pPr>
+                    <w:spacing w:after="160"/>
+                  </w:pPr>
+                </w:p>
+              </w:tc>
+            </w:tr>
+            <w:tr>
+              <w:tc>
+                <w:tcPr>
+                  <w:tcW w:w="1897" w:type="dxa"/>
+                </w:tcPr>
+                <w:p>
+                  <w:pPr>
+                    <w:spacing w:after="160"/>
+                  </w:pPr>
+                </w:p>
+              </w:tc>
+              <w:tc>
+                <w:tcPr>
+                  <w:tcW w:w="1897" w:type="dxa"/>
+                </w:tcPr>
+                <w:p>
+                  <w:pPr>
+                    <w:spacing w:after="160"/>
+                  </w:pPr>
+                </w:p>
+              </w:tc>
+              <w:tc>
+                <w:tcPr>
+                  <w:tcW w:w="1897" w:type="dxa"/>
+                </w:tcPr>
+                <w:p>
+                  <w:pPr>
+                    <w:spacing w:after="160"/>
+                  </w:pPr>
+                </w:p>
+              </w:tc>
+              <w:tc>
+                <w:tcPr>
+                  <w:tcW w:w="1897" w:type="dxa"/>
+                </w:tcPr>
+                <w:p>
+                  <w:pPr>
+                    <w:spacing w:after="160"/>
+                  </w:pPr>
+                </w:p>
+              </w:tc>
+              <w:tc>
+                <w:tcPr>
+                  <w:tcW w:w="1898" w:type="dxa"/>
+                </w:tcPr>
+                <w:p>
+                  <w:pPr>
+                    <w:spacing w:after="160"/>
+                  </w:pPr>
+                </w:p>
+              </w:tc>
+            </w:tr>
+            <w:tr>
+              <w:tc>
+                <w:tcPr>
+                  <w:tcW w:w="1897" w:type="dxa"/>
+                </w:tcPr>
+                <w:p>
+                  <w:pPr>
+                    <w:spacing w:after="160"/>
+                  </w:pPr>
+                </w:p>
+              </w:tc>
+              <w:tc>
+                <w:tcPr>
+                  <w:tcW w:w="1897" w:type="dxa"/>
+                </w:tcPr>
+                <w:p>
+                  <w:pPr>
+                    <w:spacing w:after="160"/>
+                  </w:pPr>
+                </w:p>
+              </w:tc>
+              <w:tc>
+                <w:tcPr>
+                  <w:tcW w:w="1897" w:type="dxa"/>
+                </w:tcPr>
+                <w:p>
+                  <w:pPr>
+                    <w:spacing w:after="160"/>
+                  </w:pPr>
+                </w:p>
+              </w:tc>
+              <w:tc>
+                <w:tcPr>
+                  <w:tcW w:w="1897" w:type="dxa"/>
+                </w:tcPr>
+                <w:p>
+                  <w:pPr>
+                    <w:spacing w:after="160"/>
+                  </w:pPr>
+                </w:p>
+              </w:tc>
+              <w:tc>
+                <w:tcPr>
+                  <w:tcW w:w="1898" w:type="dxa"/>
+                </w:tcPr>
+                <w:p>
+                  <w:pPr>
+                    <w:spacing w:after="160"/>
+                  </w:pPr>
+                </w:p>
+              </w:tc>
+            </w:tr>
+          </w:tbl>
           <w:p>
             <w:pPr>
               <w:spacing w:after="160"/>
-            </w:pPr>
-            <w:r>
+              <w:jc w:val="center"/>
               <w:rPr>
                 <w:i/>
                 <w:iCs/>
-                <w:color w:val="8C8C8C"/>
-                <w:sz w:val="18"/>
-                <w:szCs w:val="18"/>
-              </w:rPr>
-              <w:t>Your response:</w:t>
+              </w:rPr>
+            </w:pPr>
+            <w:r>
+              <w:rPr>
+                <w:i/>
+                <w:iCs/>
+              </w:rPr>
+              <w:t>R = Responsible | A = Accountable | C = Consult | I = Inform</w:t>
             </w:r>
           </w:p>
           <w:p>
             <w:pPr>
               <w:spacing w:after="200"/>
+              <w:jc w:val="center"/>
             </w:pPr>
           </w:p>
           <w:p>
@@ -2777,12 +3417,6 @@
         <w:gridCol w:w="9896"/>
       </w:tblGrid>
       <w:tr>
-        <w:tblPrEx>
-          <w:tblCellMar>
-            <w:top w:w="0" w:type="dxa"/>
-            <w:bottom w:w="0" w:type="dxa"/>
-          </w:tblCellMar>
-        </w:tblPrEx>
         <w:tc>
           <w:tcPr>
             <w:tcW w:w="9350" w:type="dxa"/>
@@ -2848,7 +3482,6 @@
                 <w:sz w:val="20"/>
                 <w:szCs w:val="20"/>
               </w:rPr>
-              <w:lastRenderedPageBreak/>
               <w:t>What activity durations and dependencies drive your critical path?</w:t>
             </w:r>
           </w:p>
@@ -2926,12 +3559,6 @@
         <w:gridCol w:w="9896"/>
       </w:tblGrid>
       <w:tr>
-        <w:tblPrEx>
-          <w:tblCellMar>
-            <w:top w:w="0" w:type="dxa"/>
-            <w:bottom w:w="0" w:type="dxa"/>
-          </w:tblCellMar>
-        </w:tblPrEx>
         <w:tc>
           <w:tcPr>
             <w:tcW w:w="9350" w:type="dxa"/>
@@ -3039,12 +3666,6 @@
         <w:gridCol w:w="9896"/>
       </w:tblGrid>
       <w:tr>
-        <w:tblPrEx>
-          <w:tblCellMar>
-            <w:top w:w="0" w:type="dxa"/>
-            <w:bottom w:w="0" w:type="dxa"/>
-          </w:tblCellMar>
-        </w:tblPrEx>
         <w:tc>
           <w:tcPr>
             <w:tcW w:w="9350" w:type="dxa"/>
@@ -3160,12 +3781,6 @@
         <w:gridCol w:w="9896"/>
       </w:tblGrid>
       <w:tr>
-        <w:tblPrEx>
-          <w:tblCellMar>
-            <w:top w:w="0" w:type="dxa"/>
-            <w:bottom w:w="0" w:type="dxa"/>
-          </w:tblCellMar>
-        </w:tblPrEx>
         <w:tc>
           <w:tcPr>
             <w:tcW w:w="9350" w:type="dxa"/>
@@ -3273,12 +3888,6 @@
         <w:gridCol w:w="9896"/>
       </w:tblGrid>
       <w:tr>
-        <w:tblPrEx>
-          <w:tblCellMar>
-            <w:top w:w="0" w:type="dxa"/>
-            <w:bottom w:w="0" w:type="dxa"/>
-          </w:tblCellMar>
-        </w:tblPrEx>
         <w:tc>
           <w:tcPr>
             <w:tcW w:w="9350" w:type="dxa"/>
@@ -3403,12 +4012,6 @@
         <w:gridCol w:w="9896"/>
       </w:tblGrid>
       <w:tr>
-        <w:tblPrEx>
-          <w:tblCellMar>
-            <w:top w:w="0" w:type="dxa"/>
-            <w:bottom w:w="0" w:type="dxa"/>
-          </w:tblCellMar>
-        </w:tblPrEx>
         <w:tc>
           <w:tcPr>
             <w:tcW w:w="9350" w:type="dxa"/>
@@ -3516,12 +4119,6 @@
         <w:gridCol w:w="9896"/>
       </w:tblGrid>
       <w:tr>
-        <w:tblPrEx>
-          <w:tblCellMar>
-            <w:top w:w="0" w:type="dxa"/>
-            <w:bottom w:w="0" w:type="dxa"/>
-          </w:tblCellMar>
-        </w:tblPrEx>
         <w:tc>
           <w:tcPr>
             <w:tcW w:w="9350" w:type="dxa"/>
@@ -3637,12 +4234,6 @@
         <w:gridCol w:w="9896"/>
       </w:tblGrid>
       <w:tr>
-        <w:tblPrEx>
-          <w:tblCellMar>
-            <w:top w:w="0" w:type="dxa"/>
-            <w:bottom w:w="0" w:type="dxa"/>
-          </w:tblCellMar>
-        </w:tblPrEx>
         <w:tc>
           <w:tcPr>
             <w:tcW w:w="9350" w:type="dxa"/>
@@ -3750,12 +4341,6 @@
         <w:gridCol w:w="9896"/>
       </w:tblGrid>
       <w:tr>
-        <w:tblPrEx>
-          <w:tblCellMar>
-            <w:top w:w="0" w:type="dxa"/>
-            <w:bottom w:w="0" w:type="dxa"/>
-          </w:tblCellMar>
-        </w:tblPrEx>
         <w:tc>
           <w:tcPr>
             <w:tcW w:w="9350" w:type="dxa"/>
@@ -3839,6 +4424,7 @@
                 <w:sz w:val="20"/>
                 <w:szCs w:val="20"/>
               </w:rPr>
+              <w:lastRenderedPageBreak/>
               <w:t>Given limited sponsor/user availability, what assumptions will you need to make — and how will you flag them?</w:t>
             </w:r>
           </w:p>
@@ -3898,12 +4484,6 @@
         <w:gridCol w:w="9896"/>
       </w:tblGrid>
       <w:tr>
-        <w:tblPrEx>
-          <w:tblCellMar>
-            <w:top w:w="0" w:type="dxa"/>
-            <w:bottom w:w="0" w:type="dxa"/>
-          </w:tblCellMar>
-        </w:tblPrEx>
         <w:tc>
           <w:tcPr>
             <w:tcW w:w="9350" w:type="dxa"/>
@@ -4011,12 +4591,6 @@
         <w:gridCol w:w="9896"/>
       </w:tblGrid>
       <w:tr>
-        <w:tblPrEx>
-          <w:tblCellMar>
-            <w:top w:w="0" w:type="dxa"/>
-            <w:bottom w:w="0" w:type="dxa"/>
-          </w:tblCellMar>
-        </w:tblPrEx>
         <w:tc>
           <w:tcPr>
             <w:tcW w:w="9350" w:type="dxa"/>
@@ -4046,7 +4620,6 @@
                 <w:sz w:val="20"/>
                 <w:szCs w:val="20"/>
               </w:rPr>
-              <w:lastRenderedPageBreak/>
               <w:t>Guiding questions</w:t>
             </w:r>
           </w:p>
@@ -4115,12 +4688,6 @@
         <w:gridCol w:w="9896"/>
       </w:tblGrid>
       <w:tr>
-        <w:tblPrEx>
-          <w:tblCellMar>
-            <w:top w:w="0" w:type="dxa"/>
-            <w:bottom w:w="0" w:type="dxa"/>
-          </w:tblCellMar>
-        </w:tblPrEx>
         <w:tc>
           <w:tcPr>
             <w:tcW w:w="9350" w:type="dxa"/>
@@ -4228,12 +4795,6 @@
         <w:gridCol w:w="9896"/>
       </w:tblGrid>
       <w:tr>
-        <w:tblPrEx>
-          <w:tblCellMar>
-            <w:top w:w="0" w:type="dxa"/>
-            <w:bottom w:w="0" w:type="dxa"/>
-          </w:tblCellMar>
-        </w:tblPrEx>
         <w:tc>
           <w:tcPr>
             <w:tcW w:w="9350" w:type="dxa"/>
@@ -4313,12 +4874,6 @@
         <w:gridCol w:w="9896"/>
       </w:tblGrid>
       <w:tr>
-        <w:tblPrEx>
-          <w:tblCellMar>
-            <w:top w:w="0" w:type="dxa"/>
-            <w:bottom w:w="0" w:type="dxa"/>
-          </w:tblCellMar>
-        </w:tblPrEx>
         <w:tc>
           <w:tcPr>
             <w:tcW w:w="9350" w:type="dxa"/>
@@ -4665,6 +5220,146 @@
     </w:lvl>
   </w:abstractNum>
   <w:abstractNum w:abstractNumId="3" w15:restartNumberingAfterBreak="0">
+    <w:nsid w:val="4C3D020F"/>
+    <w:multiLevelType w:val="hybridMultilevel"/>
+    <w:tmpl w:val="35880348"/>
+    <w:lvl w:ilvl="0" w:tplc="197E6C66">
+      <w:start w:val="1"/>
+      <w:numFmt w:val="bullet"/>
+      <w:lvlText w:val="-"/>
+      <w:lvlJc w:val="left"/>
+      <w:pPr>
+        <w:tabs>
+          <w:tab w:val="num" w:pos="720"/>
+        </w:tabs>
+        <w:ind w:left="720" w:hanging="360"/>
+      </w:pPr>
+      <w:rPr>
+        <w:rFonts w:ascii="Times New Roman" w:hAnsi="Times New Roman" w:hint="default"/>
+      </w:rPr>
+    </w:lvl>
+    <w:lvl w:ilvl="1" w:tplc="F8765042" w:tentative="1">
+      <w:start w:val="1"/>
+      <w:numFmt w:val="bullet"/>
+      <w:lvlText w:val="-"/>
+      <w:lvlJc w:val="left"/>
+      <w:pPr>
+        <w:tabs>
+          <w:tab w:val="num" w:pos="1440"/>
+        </w:tabs>
+        <w:ind w:left="1440" w:hanging="360"/>
+      </w:pPr>
+      <w:rPr>
+        <w:rFonts w:ascii="Times New Roman" w:hAnsi="Times New Roman" w:hint="default"/>
+      </w:rPr>
+    </w:lvl>
+    <w:lvl w:ilvl="2" w:tplc="8392F258" w:tentative="1">
+      <w:start w:val="1"/>
+      <w:numFmt w:val="bullet"/>
+      <w:lvlText w:val="-"/>
+      <w:lvlJc w:val="left"/>
+      <w:pPr>
+        <w:tabs>
+          <w:tab w:val="num" w:pos="2160"/>
+        </w:tabs>
+        <w:ind w:left="2160" w:hanging="360"/>
+      </w:pPr>
+      <w:rPr>
+        <w:rFonts w:ascii="Times New Roman" w:hAnsi="Times New Roman" w:hint="default"/>
+      </w:rPr>
+    </w:lvl>
+    <w:lvl w:ilvl="3" w:tplc="DA520D16" w:tentative="1">
+      <w:start w:val="1"/>
+      <w:numFmt w:val="bullet"/>
+      <w:lvlText w:val="-"/>
+      <w:lvlJc w:val="left"/>
+      <w:pPr>
+        <w:tabs>
+          <w:tab w:val="num" w:pos="2880"/>
+        </w:tabs>
+        <w:ind w:left="2880" w:hanging="360"/>
+      </w:pPr>
+      <w:rPr>
+        <w:rFonts w:ascii="Times New Roman" w:hAnsi="Times New Roman" w:hint="default"/>
+      </w:rPr>
+    </w:lvl>
+    <w:lvl w:ilvl="4" w:tplc="42A6689C" w:tentative="1">
+      <w:start w:val="1"/>
+      <w:numFmt w:val="bullet"/>
+      <w:lvlText w:val="-"/>
+      <w:lvlJc w:val="left"/>
+      <w:pPr>
+        <w:tabs>
+          <w:tab w:val="num" w:pos="3600"/>
+        </w:tabs>
+        <w:ind w:left="3600" w:hanging="360"/>
+      </w:pPr>
+      <w:rPr>
+        <w:rFonts w:ascii="Times New Roman" w:hAnsi="Times New Roman" w:hint="default"/>
+      </w:rPr>
+    </w:lvl>
+    <w:lvl w:ilvl="5" w:tplc="C5A84F24" w:tentative="1">
+      <w:start w:val="1"/>
+      <w:numFmt w:val="bullet"/>
+      <w:lvlText w:val="-"/>
+      <w:lvlJc w:val="left"/>
+      <w:pPr>
+        <w:tabs>
+          <w:tab w:val="num" w:pos="4320"/>
+        </w:tabs>
+        <w:ind w:left="4320" w:hanging="360"/>
+      </w:pPr>
+      <w:rPr>
+        <w:rFonts w:ascii="Times New Roman" w:hAnsi="Times New Roman" w:hint="default"/>
+      </w:rPr>
+    </w:lvl>
+    <w:lvl w:ilvl="6" w:tplc="6F6AAE68" w:tentative="1">
+      <w:start w:val="1"/>
+      <w:numFmt w:val="bullet"/>
+      <w:lvlText w:val="-"/>
+      <w:lvlJc w:val="left"/>
+      <w:pPr>
+        <w:tabs>
+          <w:tab w:val="num" w:pos="5040"/>
+        </w:tabs>
+        <w:ind w:left="5040" w:hanging="360"/>
+      </w:pPr>
+      <w:rPr>
+        <w:rFonts w:ascii="Times New Roman" w:hAnsi="Times New Roman" w:hint="default"/>
+      </w:rPr>
+    </w:lvl>
+    <w:lvl w:ilvl="7" w:tplc="4CC45AFC" w:tentative="1">
+      <w:start w:val="1"/>
+      <w:numFmt w:val="bullet"/>
+      <w:lvlText w:val="-"/>
+      <w:lvlJc w:val="left"/>
+      <w:pPr>
+        <w:tabs>
+          <w:tab w:val="num" w:pos="5760"/>
+        </w:tabs>
+        <w:ind w:left="5760" w:hanging="360"/>
+      </w:pPr>
+      <w:rPr>
+        <w:rFonts w:ascii="Times New Roman" w:hAnsi="Times New Roman" w:hint="default"/>
+      </w:rPr>
+    </w:lvl>
+    <w:lvl w:ilvl="8" w:tplc="F92227EE" w:tentative="1">
+      <w:start w:val="1"/>
+      <w:numFmt w:val="bullet"/>
+      <w:lvlText w:val="-"/>
+      <w:lvlJc w:val="left"/>
+      <w:pPr>
+        <w:tabs>
+          <w:tab w:val="num" w:pos="6480"/>
+        </w:tabs>
+        <w:ind w:left="6480" w:hanging="360"/>
+      </w:pPr>
+      <w:rPr>
+        <w:rFonts w:ascii="Times New Roman" w:hAnsi="Times New Roman" w:hint="default"/>
+      </w:rPr>
+    </w:lvl>
+  </w:abstractNum>
+  <w:abstractNum w:abstractNumId="4" w15:restartNumberingAfterBreak="0">
     <w:nsid w:val="6AFB75A0"/>
     <w:multiLevelType w:val="hybridMultilevel"/>
     <w:tmpl w:val="86FAC792"/>
@@ -4776,7 +5471,7 @@
       </w:rPr>
     </w:lvl>
   </w:abstractNum>
-  <w:abstractNum w:abstractNumId="4" w15:restartNumberingAfterBreak="0">
+  <w:abstractNum w:abstractNumId="5" w15:restartNumberingAfterBreak="0">
     <w:nsid w:val="79BE531A"/>
     <w:multiLevelType w:val="hybridMultilevel"/>
     <w:tmpl w:val="3A9CD33E"/>
@@ -4863,7 +5558,7 @@
     </w:lvl>
   </w:abstractNum>
   <w:num w:numId="1" w16cid:durableId="1379011407">
-    <w:abstractNumId w:val="4"/>
+    <w:abstractNumId w:val="5"/>
     <w:lvlOverride w:ilvl="0">
       <w:startOverride w:val="1"/>
     </w:lvlOverride>
@@ -4875,6 +5570,9 @@
     <w:abstractNumId w:val="0"/>
   </w:num>
   <w:num w:numId="4" w16cid:durableId="783496828">
+    <w:abstractNumId w:val="4"/>
+  </w:num>
+  <w:num w:numId="5" w16cid:durableId="535239206">
     <w:abstractNumId w:val="3"/>
   </w:num>
 </w:numbering>
@@ -5362,7 +6060,6 @@
   <w:style w:type="character" w:default="1" w:styleId="DefaultParagraphFont">
     <w:name w:val="Default Paragraph Font"/>
     <w:uiPriority w:val="1"/>
-    <w:semiHidden/>
     <w:unhideWhenUsed/>
   </w:style>
   <w:style w:type="table" w:default="1" w:styleId="TableNormal">
@@ -5477,6 +6174,22 @@
       <w:sz w:val="20"/>
       <w:szCs w:val="20"/>
     </w:rPr>
+  </w:style>
+  <w:style w:type="table" w:styleId="TableGrid">
+    <w:name w:val="Table Grid"/>
+    <w:basedOn w:val="TableNormal"/>
+    <w:uiPriority w:val="39"/>
+    <w:rsid w:val="00F634C8"/>
+    <w:tblPr>
+      <w:tblBorders>
+        <w:top w:val="single" w:sz="4" w:space="0" w:color="auto"/>
+        <w:left w:val="single" w:sz="4" w:space="0" w:color="auto"/>
+        <w:bottom w:val="single" w:sz="4" w:space="0" w:color="auto"/>
+        <w:right w:val="single" w:sz="4" w:space="0" w:color="auto"/>
+        <w:insideH w:val="single" w:sz="4" w:space="0" w:color="auto"/>
+        <w:insideV w:val="single" w:sz="4" w:space="0" w:color="auto"/>
+      </w:tblBorders>
+    </w:tblPr>
   </w:style>
 </w:styles>
 </file>

</xml_diff>